<commit_message>
Make section headings strong & professional: solid saffron bars with white bold text (PDF + DOCX)
</commit_message>
<xml_diff>
--- a/Bio-Data-Kaptan-Singh.docx
+++ b/Bio-Data-Kaptan-Singh.docx
@@ -381,16 +381,16 @@
     </w:p>
     <w:p>
       <w:pPr>
-        <w:spacing w:before="160" w:after="80"/>
-        <w:shd w:val="clear" w:color="auto" w:fill="FFF5EC"/>
+        <w:spacing w:before="180" w:after="100"/>
+        <w:shd w:val="clear" w:color="auto" w:fill="FF9933"/>
         <w:pBdr>
-          <w:left w:val="single" w:sz="24" w:space="6" w:color="FF9933"/>
+          <w:left w:val="single" w:sz="32" w:space="6" w:color="138808"/>
         </w:pBdr>
       </w:pPr>
       <w:r>
         <w:rPr>
           <w:b/>
-          <w:color w:val="222222"/>
+          <w:color w:val="FFFFFF"/>
           <w:sz w:val="26"/>
           <w:rFonts w:ascii="Nirmala UI" w:hAnsi="Nirmala UI" w:cs="Nirmala UI"/>
         </w:rPr>
@@ -492,16 +492,16 @@
     </w:p>
     <w:p>
       <w:pPr>
-        <w:spacing w:before="160" w:after="80"/>
-        <w:shd w:val="clear" w:color="auto" w:fill="FFF5EC"/>
+        <w:spacing w:before="180" w:after="100"/>
+        <w:shd w:val="clear" w:color="auto" w:fill="FF9933"/>
         <w:pBdr>
-          <w:left w:val="single" w:sz="24" w:space="6" w:color="FF9933"/>
+          <w:left w:val="single" w:sz="32" w:space="6" w:color="138808"/>
         </w:pBdr>
       </w:pPr>
       <w:r>
         <w:rPr>
           <w:b/>
-          <w:color w:val="222222"/>
+          <w:color w:val="FFFFFF"/>
           <w:sz w:val="26"/>
           <w:rFonts w:ascii="Nirmala UI" w:hAnsi="Nirmala UI" w:cs="Nirmala UI"/>
         </w:rPr>
@@ -570,16 +570,16 @@
     </w:p>
     <w:p>
       <w:pPr>
-        <w:spacing w:before="160" w:after="80"/>
-        <w:shd w:val="clear" w:color="auto" w:fill="FFF5EC"/>
+        <w:spacing w:before="180" w:after="100"/>
+        <w:shd w:val="clear" w:color="auto" w:fill="FF9933"/>
         <w:pBdr>
-          <w:left w:val="single" w:sz="24" w:space="6" w:color="FF9933"/>
+          <w:left w:val="single" w:sz="32" w:space="6" w:color="138808"/>
         </w:pBdr>
       </w:pPr>
       <w:r>
         <w:rPr>
           <w:b/>
-          <w:color w:val="222222"/>
+          <w:color w:val="FFFFFF"/>
           <w:sz w:val="26"/>
           <w:rFonts w:ascii="Nirmala UI" w:hAnsi="Nirmala UI" w:cs="Nirmala UI"/>
         </w:rPr>
@@ -624,16 +624,16 @@
     </w:p>
     <w:p>
       <w:pPr>
-        <w:spacing w:before="160" w:after="80"/>
-        <w:shd w:val="clear" w:color="auto" w:fill="FFF5EC"/>
+        <w:spacing w:before="180" w:after="100"/>
+        <w:shd w:val="clear" w:color="auto" w:fill="FF9933"/>
         <w:pBdr>
-          <w:left w:val="single" w:sz="24" w:space="6" w:color="FF9933"/>
+          <w:left w:val="single" w:sz="32" w:space="6" w:color="138808"/>
         </w:pBdr>
       </w:pPr>
       <w:r>
         <w:rPr>
           <w:b/>
-          <w:color w:val="222222"/>
+          <w:color w:val="FFFFFF"/>
           <w:sz w:val="26"/>
           <w:rFonts w:ascii="Nirmala UI" w:hAnsi="Nirmala UI" w:cs="Nirmala UI"/>
         </w:rPr>
@@ -678,16 +678,16 @@
     </w:p>
     <w:p>
       <w:pPr>
-        <w:spacing w:before="160" w:after="80"/>
-        <w:shd w:val="clear" w:color="auto" w:fill="FFF5EC"/>
+        <w:spacing w:before="180" w:after="100"/>
+        <w:shd w:val="clear" w:color="auto" w:fill="FF9933"/>
         <w:pBdr>
-          <w:left w:val="single" w:sz="24" w:space="6" w:color="FF9933"/>
+          <w:left w:val="single" w:sz="32" w:space="6" w:color="138808"/>
         </w:pBdr>
       </w:pPr>
       <w:r>
         <w:rPr>
           <w:b/>
-          <w:color w:val="222222"/>
+          <w:color w:val="FFFFFF"/>
           <w:sz w:val="26"/>
           <w:rFonts w:ascii="Nirmala UI" w:hAnsi="Nirmala UI" w:cs="Nirmala UI"/>
         </w:rPr>
@@ -772,16 +772,16 @@
     </w:p>
     <w:p>
       <w:pPr>
-        <w:spacing w:before="160" w:after="80"/>
-        <w:shd w:val="clear" w:color="auto" w:fill="FFF5EC"/>
+        <w:spacing w:before="180" w:after="100"/>
+        <w:shd w:val="clear" w:color="auto" w:fill="FF9933"/>
         <w:pBdr>
-          <w:left w:val="single" w:sz="24" w:space="6" w:color="FF9933"/>
+          <w:left w:val="single" w:sz="32" w:space="6" w:color="138808"/>
         </w:pBdr>
       </w:pPr>
       <w:r>
         <w:rPr>
           <w:b/>
-          <w:color w:val="222222"/>
+          <w:color w:val="FFFFFF"/>
           <w:sz w:val="26"/>
           <w:rFonts w:ascii="Nirmala UI" w:hAnsi="Nirmala UI" w:cs="Nirmala UI"/>
         </w:rPr>
@@ -925,16 +925,16 @@
     </w:p>
     <w:p>
       <w:pPr>
-        <w:spacing w:before="160" w:after="80"/>
-        <w:shd w:val="clear" w:color="auto" w:fill="FFF5EC"/>
+        <w:spacing w:before="180" w:after="100"/>
+        <w:shd w:val="clear" w:color="auto" w:fill="FF9933"/>
         <w:pBdr>
-          <w:left w:val="single" w:sz="24" w:space="6" w:color="FF9933"/>
+          <w:left w:val="single" w:sz="32" w:space="6" w:color="138808"/>
         </w:pBdr>
       </w:pPr>
       <w:r>
         <w:rPr>
           <w:b/>
-          <w:color w:val="222222"/>
+          <w:color w:val="FFFFFF"/>
           <w:sz w:val="26"/>
           <w:rFonts w:ascii="Nirmala UI" w:hAnsi="Nirmala UI" w:cs="Nirmala UI"/>
         </w:rPr>

</xml_diff>

<commit_message>
Polish to high professional level: header band with emblem, clean 2-page layout, row-separated table, photo captions, refined signature; fix star glyph to trophy
</commit_message>
<xml_diff>
--- a/Bio-Data-Kaptan-Singh.docx
+++ b/Bio-Data-Kaptan-Singh.docx
@@ -2,6 +2,61 @@
 <file path=word/document.xml><?xml version="1.0" encoding="utf-8"?>
 <w:document xmlns:wpc="http://schemas.microsoft.com/office/word/2010/wordprocessingCanvas" xmlns:mo="http://schemas.microsoft.com/office/mac/office/2008/main" xmlns:mc="http://schemas.openxmlformats.org/markup-compatibility/2006" xmlns:mv="urn:schemas-microsoft-com:mac:vml" xmlns:o="urn:schemas-microsoft-com:office:office" xmlns:r="http://schemas.openxmlformats.org/officeDocument/2006/relationships" xmlns:m="http://schemas.openxmlformats.org/officeDocument/2006/math" xmlns:v="urn:schemas-microsoft-com:vml" xmlns:wp14="http://schemas.microsoft.com/office/word/2010/wordprocessingDrawing" xmlns:wp="http://schemas.openxmlformats.org/drawingml/2006/wordprocessingDrawing" xmlns:w10="urn:schemas-microsoft-com:office:word" xmlns:w="http://schemas.openxmlformats.org/wordprocessingml/2006/main" xmlns:w14="http://schemas.microsoft.com/office/word/2010/wordml" xmlns:wpg="http://schemas.microsoft.com/office/word/2010/wordprocessingGroup" xmlns:wpi="http://schemas.microsoft.com/office/word/2010/wordprocessingInk" xmlns:wne="http://schemas.microsoft.com/office/word/2006/wordml" xmlns:wps="http://schemas.microsoft.com/office/word/2010/wordprocessingShape" mc:Ignorable="w14 wp14">
   <w:body>
+    <w:p>
+      <w:pPr>
+        <w:spacing w:after="0"/>
+        <w:jc w:val="center"/>
+      </w:pPr>
+      <w:r>
+        <w:drawing>
+          <wp:inline xmlns:a="http://schemas.openxmlformats.org/drawingml/2006/main" xmlns:pic="http://schemas.openxmlformats.org/drawingml/2006/picture">
+            <wp:extent cx="720000" cy="720000"/>
+            <wp:docPr id="1" name="Picture 1"/>
+            <wp:cNvGraphicFramePr>
+              <a:graphicFrameLocks noChangeAspect="1"/>
+            </wp:cNvGraphicFramePr>
+            <a:graphic>
+              <a:graphicData uri="http://schemas.openxmlformats.org/drawingml/2006/picture">
+                <pic:pic>
+                  <pic:nvPicPr>
+                    <pic:cNvPr id="0" name="bjp-logo.png"/>
+                    <pic:cNvPicPr/>
+                  </pic:nvPicPr>
+                  <pic:blipFill>
+                    <a:blip r:embed="rId9"/>
+                    <a:stretch>
+                      <a:fillRect/>
+                    </a:stretch>
+                  </pic:blipFill>
+                  <pic:spPr>
+                    <a:xfrm>
+                      <a:off x="0" y="0"/>
+                      <a:ext cx="720000" cy="720000"/>
+                    </a:xfrm>
+                    <a:prstGeom prst="rect"/>
+                  </pic:spPr>
+                </pic:pic>
+              </a:graphicData>
+            </a:graphic>
+          </wp:inline>
+        </w:drawing>
+      </w:r>
+    </w:p>
+    <w:p>
+      <w:pPr>
+        <w:spacing w:after="0"/>
+        <w:jc w:val="center"/>
+      </w:pPr>
+      <w:r>
+        <w:rPr>
+          <w:b/>
+          <w:color w:val="E97E12"/>
+          <w:sz w:val="28"/>
+          <w:rFonts w:ascii="Nirmala UI" w:hAnsi="Nirmala UI" w:cs="Nirmala UI"/>
+        </w:rPr>
+        <w:t>भारतीय जनता पार्टी</w:t>
+      </w:r>
+    </w:p>
     <w:p>
       <w:pPr>
         <w:spacing w:after="40"/>
@@ -9,11 +64,11 @@
       </w:pPr>
       <w:r>
         <w:rPr>
-          <w:b/>
-          <w:sz w:val="26"/>
+          <w:color w:val="6B6B6B"/>
+          <w:sz w:val="20"/>
           <w:rFonts w:ascii="Nirmala UI" w:hAnsi="Nirmala UI" w:cs="Nirmala UI"/>
         </w:rPr>
-        <w:t>भारतीय जनता पार्टी — जिला दतिया (मध्य प्रदेश)</w:t>
+        <w:t>जिला दतिया (मध्य प्रदेश)</w:t>
       </w:r>
     </w:p>
     <w:p>
@@ -24,8 +79,8 @@
       <w:r>
         <w:rPr>
           <w:b/>
-          <w:color w:val="000000"/>
           <w:sz w:val="44"/>
+          <w:u w:val="single"/>
           <w:rFonts w:ascii="Nirmala UI" w:hAnsi="Nirmala UI" w:cs="Nirmala UI"/>
         </w:rPr>
         <w:t>परिचय — पत्र</w:t>
@@ -33,38 +88,48 @@
     </w:p>
     <w:p>
       <w:pPr>
-        <w:spacing w:after="200"/>
+        <w:spacing w:after="160"/>
         <w:jc w:val="center"/>
-        <w:shd w:val="clear" w:color="auto" w:fill="FFF5EC"/>
+        <w:shd w:val="clear" w:color="auto" w:fill="FFF6EC"/>
       </w:pPr>
       <w:r>
         <w:rPr>
           <w:b/>
-          <w:sz w:val="22"/>
           <w:rFonts w:ascii="Nirmala UI" w:hAnsi="Nirmala UI" w:cs="Nirmala UI"/>
         </w:rPr>
-        <w:t>उद्देश्य: एक समर्पित, अनुशासित एवं संघर्षशील कार्यकर्ता — जिसका एकमात्र लक्ष्य दतिया जिले में संगठन को बूथ-स्तर तक सशक्त कर पार्टी को पुनः विजयी बनाना है।</w:t>
+        <w:t xml:space="preserve">उद्देश्य: </w:t>
+      </w:r>
+      <w:r>
+        <w:rPr>
+          <w:b/>
+          <w:rFonts w:ascii="Nirmala UI" w:hAnsi="Nirmala UI" w:cs="Nirmala UI"/>
+        </w:rPr>
+        <w:t>एक समर्पित, अनुशासित एवं संघर्षशील कार्यकर्ता — जिसका एकमात्र लक्ष्य दतिया जिले में संगठन को बूथ-स्तर तक सशक्त कर पार्टी को पुनः विजयी बनाना है।</w:t>
       </w:r>
     </w:p>
     <w:tbl>
       <w:tblPr>
         <w:tblW w:type="auto" w:w="0"/>
+        <w:jc w:val="center"/>
         <w:tblLook w:firstColumn="1" w:firstRow="1" w:lastColumn="0" w:lastRow="0" w:noHBand="0" w:noVBand="1" w:val="04A0"/>
       </w:tblPr>
       <w:tblGrid>
-        <w:gridCol w:w="2551"/>
-        <w:gridCol w:w="7370"/>
+        <w:gridCol w:w="2721"/>
+        <w:gridCol w:w="7483"/>
       </w:tblGrid>
       <w:tr>
         <w:tc>
           <w:tcPr>
-            <w:tcW w:type="dxa" w:w="2551"/>
+            <w:tcW w:type="dxa" w:w="2721"/>
+            <w:tcBorders>
+              <w:bottom w:val="single" w:sz="4" w:space="0" w:color="E7E7E7"/>
+            </w:tcBorders>
           </w:tcPr>
           <w:p>
             <w:r>
               <w:rPr>
                 <w:b/>
-                <w:color w:val="138808"/>
+                <w:color w:val="0E6606"/>
                 <w:rFonts w:ascii="Nirmala UI" w:hAnsi="Nirmala UI" w:cs="Nirmala UI"/>
               </w:rPr>
               <w:t>नाम</w:t>
@@ -73,7 +138,10 @@
         </w:tc>
         <w:tc>
           <w:tcPr>
-            <w:tcW w:type="dxa" w:w="7370"/>
+            <w:tcW w:type="dxa" w:w="7483"/>
+            <w:tcBorders>
+              <w:bottom w:val="single" w:sz="4" w:space="0" w:color="E7E7E7"/>
+            </w:tcBorders>
           </w:tcPr>
           <w:p>
             <w:r>
@@ -89,13 +157,16 @@
       <w:tr>
         <w:tc>
           <w:tcPr>
-            <w:tcW w:type="dxa" w:w="2551"/>
+            <w:tcW w:type="dxa" w:w="2721"/>
+            <w:tcBorders>
+              <w:bottom w:val="single" w:sz="4" w:space="0" w:color="E7E7E7"/>
+            </w:tcBorders>
           </w:tcPr>
           <w:p>
             <w:r>
               <w:rPr>
                 <w:b/>
-                <w:color w:val="138808"/>
+                <w:color w:val="0E6606"/>
                 <w:rFonts w:ascii="Nirmala UI" w:hAnsi="Nirmala UI" w:cs="Nirmala UI"/>
               </w:rPr>
               <w:t>पिता का नाम</w:t>
@@ -104,7 +175,10 @@
         </w:tc>
         <w:tc>
           <w:tcPr>
-            <w:tcW w:type="dxa" w:w="7370"/>
+            <w:tcW w:type="dxa" w:w="7483"/>
+            <w:tcBorders>
+              <w:bottom w:val="single" w:sz="4" w:space="0" w:color="E7E7E7"/>
+            </w:tcBorders>
           </w:tcPr>
           <w:p>
             <w:r>
@@ -120,13 +194,16 @@
       <w:tr>
         <w:tc>
           <w:tcPr>
-            <w:tcW w:type="dxa" w:w="2551"/>
+            <w:tcW w:type="dxa" w:w="2721"/>
+            <w:tcBorders>
+              <w:bottom w:val="single" w:sz="4" w:space="0" w:color="E7E7E7"/>
+            </w:tcBorders>
           </w:tcPr>
           <w:p>
             <w:r>
               <w:rPr>
                 <w:b/>
-                <w:color w:val="138808"/>
+                <w:color w:val="0E6606"/>
                 <w:rFonts w:ascii="Nirmala UI" w:hAnsi="Nirmala UI" w:cs="Nirmala UI"/>
               </w:rPr>
               <w:t>जन्म तिथि</w:t>
@@ -135,7 +212,10 @@
         </w:tc>
         <w:tc>
           <w:tcPr>
-            <w:tcW w:type="dxa" w:w="7370"/>
+            <w:tcW w:type="dxa" w:w="7483"/>
+            <w:tcBorders>
+              <w:bottom w:val="single" w:sz="4" w:space="0" w:color="E7E7E7"/>
+            </w:tcBorders>
           </w:tcPr>
           <w:p>
             <w:r>
@@ -151,13 +231,16 @@
       <w:tr>
         <w:tc>
           <w:tcPr>
-            <w:tcW w:type="dxa" w:w="2551"/>
+            <w:tcW w:type="dxa" w:w="2721"/>
+            <w:tcBorders>
+              <w:bottom w:val="single" w:sz="4" w:space="0" w:color="E7E7E7"/>
+            </w:tcBorders>
           </w:tcPr>
           <w:p>
             <w:r>
               <w:rPr>
                 <w:b/>
-                <w:color w:val="138808"/>
+                <w:color w:val="0E6606"/>
                 <w:rFonts w:ascii="Nirmala UI" w:hAnsi="Nirmala UI" w:cs="Nirmala UI"/>
               </w:rPr>
               <w:t>शैक्षणिक योग्यता</w:t>
@@ -166,7 +249,10 @@
         </w:tc>
         <w:tc>
           <w:tcPr>
-            <w:tcW w:type="dxa" w:w="7370"/>
+            <w:tcW w:type="dxa" w:w="7483"/>
+            <w:tcBorders>
+              <w:bottom w:val="single" w:sz="4" w:space="0" w:color="E7E7E7"/>
+            </w:tcBorders>
           </w:tcPr>
           <w:p>
             <w:r>
@@ -182,13 +268,16 @@
       <w:tr>
         <w:tc>
           <w:tcPr>
-            <w:tcW w:type="dxa" w:w="2551"/>
+            <w:tcW w:type="dxa" w:w="2721"/>
+            <w:tcBorders>
+              <w:bottom w:val="single" w:sz="4" w:space="0" w:color="E7E7E7"/>
+            </w:tcBorders>
           </w:tcPr>
           <w:p>
             <w:r>
               <w:rPr>
                 <w:b/>
-                <w:color w:val="138808"/>
+                <w:color w:val="0E6606"/>
                 <w:rFonts w:ascii="Nirmala UI" w:hAnsi="Nirmala UI" w:cs="Nirmala UI"/>
               </w:rPr>
               <w:t>व्यवसाय</w:t>
@@ -197,7 +286,10 @@
         </w:tc>
         <w:tc>
           <w:tcPr>
-            <w:tcW w:type="dxa" w:w="7370"/>
+            <w:tcW w:type="dxa" w:w="7483"/>
+            <w:tcBorders>
+              <w:bottom w:val="single" w:sz="4" w:space="0" w:color="E7E7E7"/>
+            </w:tcBorders>
           </w:tcPr>
           <w:p>
             <w:r>
@@ -223,13 +315,16 @@
       <w:tr>
         <w:tc>
           <w:tcPr>
-            <w:tcW w:type="dxa" w:w="2551"/>
+            <w:tcW w:type="dxa" w:w="2721"/>
+            <w:tcBorders>
+              <w:bottom w:val="single" w:sz="4" w:space="0" w:color="E7E7E7"/>
+            </w:tcBorders>
           </w:tcPr>
           <w:p>
             <w:r>
               <w:rPr>
                 <w:b/>
-                <w:color w:val="138808"/>
+                <w:color w:val="0E6606"/>
                 <w:rFonts w:ascii="Nirmala UI" w:hAnsi="Nirmala UI" w:cs="Nirmala UI"/>
               </w:rPr>
               <w:t>निवास स्थान</w:t>
@@ -238,7 +333,10 @@
         </w:tc>
         <w:tc>
           <w:tcPr>
-            <w:tcW w:type="dxa" w:w="7370"/>
+            <w:tcW w:type="dxa" w:w="7483"/>
+            <w:tcBorders>
+              <w:bottom w:val="single" w:sz="4" w:space="0" w:color="E7E7E7"/>
+            </w:tcBorders>
           </w:tcPr>
           <w:p>
             <w:r>
@@ -254,13 +352,16 @@
       <w:tr>
         <w:tc>
           <w:tcPr>
-            <w:tcW w:type="dxa" w:w="2551"/>
+            <w:tcW w:type="dxa" w:w="2721"/>
+            <w:tcBorders>
+              <w:bottom w:val="single" w:sz="4" w:space="0" w:color="E7E7E7"/>
+            </w:tcBorders>
           </w:tcPr>
           <w:p>
             <w:r>
               <w:rPr>
                 <w:b/>
-                <w:color w:val="138808"/>
+                <w:color w:val="0E6606"/>
                 <w:rFonts w:ascii="Nirmala UI" w:hAnsi="Nirmala UI" w:cs="Nirmala UI"/>
               </w:rPr>
               <w:t>कार्यालय पता</w:t>
@@ -269,7 +370,10 @@
         </w:tc>
         <w:tc>
           <w:tcPr>
-            <w:tcW w:type="dxa" w:w="7370"/>
+            <w:tcW w:type="dxa" w:w="7483"/>
+            <w:tcBorders>
+              <w:bottom w:val="single" w:sz="4" w:space="0" w:color="E7E7E7"/>
+            </w:tcBorders>
           </w:tcPr>
           <w:p>
             <w:r>
@@ -285,13 +389,16 @@
       <w:tr>
         <w:tc>
           <w:tcPr>
-            <w:tcW w:type="dxa" w:w="2551"/>
+            <w:tcW w:type="dxa" w:w="2721"/>
+            <w:tcBorders>
+              <w:bottom w:val="single" w:sz="4" w:space="0" w:color="E7E7E7"/>
+            </w:tcBorders>
           </w:tcPr>
           <w:p>
             <w:r>
               <w:rPr>
                 <w:b/>
-                <w:color w:val="138808"/>
+                <w:color w:val="0E6606"/>
                 <w:rFonts w:ascii="Nirmala UI" w:hAnsi="Nirmala UI" w:cs="Nirmala UI"/>
               </w:rPr>
               <w:t>मोबाइल</w:t>
@@ -300,7 +407,10 @@
         </w:tc>
         <w:tc>
           <w:tcPr>
-            <w:tcW w:type="dxa" w:w="7370"/>
+            <w:tcW w:type="dxa" w:w="7483"/>
+            <w:tcBorders>
+              <w:bottom w:val="single" w:sz="4" w:space="0" w:color="E7E7E7"/>
+            </w:tcBorders>
           </w:tcPr>
           <w:p>
             <w:r>
@@ -316,13 +426,16 @@
       <w:tr>
         <w:tc>
           <w:tcPr>
-            <w:tcW w:type="dxa" w:w="2551"/>
+            <w:tcW w:type="dxa" w:w="2721"/>
+            <w:tcBorders>
+              <w:bottom w:val="single" w:sz="4" w:space="0" w:color="E7E7E7"/>
+            </w:tcBorders>
           </w:tcPr>
           <w:p>
             <w:r>
               <w:rPr>
                 <w:b/>
-                <w:color w:val="138808"/>
+                <w:color w:val="0E6606"/>
                 <w:rFonts w:ascii="Nirmala UI" w:hAnsi="Nirmala UI" w:cs="Nirmala UI"/>
               </w:rPr>
               <w:t>ईमेल</w:t>
@@ -331,7 +444,10 @@
         </w:tc>
         <w:tc>
           <w:tcPr>
-            <w:tcW w:type="dxa" w:w="7370"/>
+            <w:tcW w:type="dxa" w:w="7483"/>
+            <w:tcBorders>
+              <w:bottom w:val="single" w:sz="4" w:space="0" w:color="E7E7E7"/>
+            </w:tcBorders>
           </w:tcPr>
           <w:p>
             <w:r>
@@ -352,25 +468,25 @@
     </w:p>
     <w:p>
       <w:pPr>
-        <w:shd w:val="clear" w:color="auto" w:fill="E8F5E9"/>
+        <w:shd w:val="clear" w:color="auto" w:fill="EAF6EA"/>
         <w:pBdr>
-          <w:left w:val="single" w:sz="24" w:space="6" w:color="138808"/>
+          <w:left w:val="single" w:sz="36" w:space="6" w:color="138808"/>
         </w:pBdr>
       </w:pPr>
       <w:r>
         <w:rPr>
           <w:b/>
-          <w:color w:val="0A7D0A"/>
+          <w:color w:val="0E6606"/>
           <w:sz w:val="24"/>
           <w:rFonts w:ascii="Nirmala UI" w:hAnsi="Nirmala UI" w:cs="Nirmala UI"/>
         </w:rPr>
-        <w:t>★ विशेष उपलब्धि — बूथ क्रमांक 156</w:t>
+        <w:t>🏆 विशेष उपलब्धि — बूथ क्रमांक 156</w:t>
       </w:r>
     </w:p>
     <w:p>
       <w:pPr>
-        <w:shd w:val="clear" w:color="auto" w:fill="E8F5E9"/>
-        <w:spacing w:after="160"/>
+        <w:shd w:val="clear" w:color="auto" w:fill="EAF6EA"/>
+        <w:spacing w:after="120"/>
       </w:pPr>
       <w:r>
         <w:rPr>
@@ -384,7 +500,7 @@
         <w:spacing w:before="180" w:after="100"/>
         <w:shd w:val="clear" w:color="auto" w:fill="FF9933"/>
         <w:pBdr>
-          <w:left w:val="single" w:sz="32" w:space="6" w:color="138808"/>
+          <w:left w:val="single" w:sz="36" w:space="6" w:color="138808"/>
         </w:pBdr>
       </w:pPr>
       <w:r>
@@ -495,7 +611,7 @@
         <w:spacing w:before="180" w:after="100"/>
         <w:shd w:val="clear" w:color="auto" w:fill="FF9933"/>
         <w:pBdr>
-          <w:left w:val="single" w:sz="32" w:space="6" w:color="138808"/>
+          <w:left w:val="single" w:sz="36" w:space="6" w:color="138808"/>
         </w:pBdr>
       </w:pPr>
       <w:r>
@@ -573,7 +689,7 @@
         <w:spacing w:before="180" w:after="100"/>
         <w:shd w:val="clear" w:color="auto" w:fill="FF9933"/>
         <w:pBdr>
-          <w:left w:val="single" w:sz="32" w:space="6" w:color="138808"/>
+          <w:left w:val="single" w:sz="36" w:space="6" w:color="138808"/>
         </w:pBdr>
       </w:pPr>
       <w:r>
@@ -627,7 +743,7 @@
         <w:spacing w:before="180" w:after="100"/>
         <w:shd w:val="clear" w:color="auto" w:fill="FF9933"/>
         <w:pBdr>
-          <w:left w:val="single" w:sz="32" w:space="6" w:color="138808"/>
+          <w:left w:val="single" w:sz="36" w:space="6" w:color="138808"/>
         </w:pBdr>
       </w:pPr>
       <w:r>
@@ -681,7 +797,7 @@
         <w:spacing w:before="180" w:after="100"/>
         <w:shd w:val="clear" w:color="auto" w:fill="FF9933"/>
         <w:pBdr>
-          <w:left w:val="single" w:sz="32" w:space="6" w:color="138808"/>
+          <w:left w:val="single" w:sz="36" w:space="6" w:color="138808"/>
         </w:pBdr>
       </w:pPr>
       <w:r>
@@ -758,7 +874,7 @@
       <w:r>
         <w:rPr>
           <w:b/>
-          <w:color w:val="138808"/>
+          <w:color w:val="0E6606"/>
           <w:rFonts w:ascii="Nirmala UI" w:hAnsi="Nirmala UI" w:cs="Nirmala UI"/>
         </w:rPr>
         <w:t xml:space="preserve">रुचि : </w:t>
@@ -771,41 +887,57 @@
       </w:r>
     </w:p>
     <w:p>
+      <w:r>
+        <w:br w:type="page"/>
+      </w:r>
+    </w:p>
+    <w:p>
       <w:pPr>
-        <w:spacing w:before="180" w:after="100"/>
-        <w:shd w:val="clear" w:color="auto" w:fill="FF9933"/>
-        <w:pBdr>
-          <w:left w:val="single" w:sz="32" w:space="6" w:color="138808"/>
-        </w:pBdr>
+        <w:jc w:val="center"/>
       </w:pPr>
       <w:r>
         <w:rPr>
           <w:b/>
-          <w:color w:val="FFFFFF"/>
-          <w:sz w:val="26"/>
+          <w:color w:val="E97E12"/>
+          <w:sz w:val="36"/>
           <w:rFonts w:ascii="Nirmala UI" w:hAnsi="Nirmala UI" w:cs="Nirmala UI"/>
         </w:rPr>
-        <w:t>फोटो परिशिष्ट (यहाँ फोटो लगाएँ)</w:t>
+        <w:t>फोटो परिशिष्ट</w:t>
+      </w:r>
+    </w:p>
+    <w:p>
+      <w:pPr>
+        <w:spacing w:after="120"/>
+        <w:jc w:val="center"/>
+      </w:pPr>
+      <w:r>
+        <w:rPr>
+          <w:color w:val="6B6B6B"/>
+          <w:sz w:val="20"/>
+          <w:rFonts w:ascii="Nirmala UI" w:hAnsi="Nirmala UI" w:cs="Nirmala UI"/>
+        </w:rPr>
+        <w:t>वरिष्ठ नेतृत्व, संगठन एवं सामाजिक कार्यों के साथ सहभागिता</w:t>
       </w:r>
     </w:p>
     <w:tbl>
       <w:tblPr>
         <w:tblStyle w:val="TableGrid"/>
         <w:tblW w:type="auto" w:w="0"/>
+        <w:jc w:val="center"/>
         <w:tblLook w:firstColumn="1" w:firstRow="1" w:lastColumn="0" w:lastRow="0" w:noHBand="0" w:noVBand="1" w:val="04A0"/>
       </w:tblPr>
       <w:tblGrid>
-        <w:gridCol w:w="3475"/>
-        <w:gridCol w:w="3475"/>
-        <w:gridCol w:w="3475"/>
+        <w:gridCol w:w="3513"/>
+        <w:gridCol w:w="3513"/>
+        <w:gridCol w:w="3513"/>
       </w:tblGrid>
       <w:tr>
         <w:trPr>
-          <w:trHeight w:val="1701"/>
+          <w:trHeight w:val="1928"/>
         </w:trPr>
         <w:tc>
           <w:tcPr>
-            <w:tcW w:type="dxa" w:w="3475"/>
+            <w:tcW w:type="dxa" w:w="3513"/>
           </w:tcPr>
           <w:p>
             <w:pPr>
@@ -813,17 +945,31 @@
             </w:pPr>
             <w:r>
               <w:rPr>
-                <w:color w:val="888888"/>
+                <w:color w:val="9A9A9A"/>
                 <w:sz w:val="18"/>
                 <w:rFonts w:ascii="Nirmala UI" w:hAnsi="Nirmala UI" w:cs="Nirmala UI"/>
               </w:rPr>
-              <w:t>वरिष्ठ नेताओं के साथ - फोटो 1</w:t>
+              <w:t>[ फोटो 1 ]</w:t>
+            </w:r>
+          </w:p>
+          <w:p>
+            <w:pPr>
+              <w:jc w:val="center"/>
+            </w:pPr>
+            <w:r>
+              <w:rPr>
+                <w:b/>
+                <w:color w:val="555555"/>
+                <w:sz w:val="18"/>
+                <w:rFonts w:ascii="Nirmala UI" w:hAnsi="Nirmala UI" w:cs="Nirmala UI"/>
+              </w:rPr>
+              <w:t>माननीय मुख्यमंत्री जी के साथ</w:t>
             </w:r>
           </w:p>
         </w:tc>
         <w:tc>
           <w:tcPr>
-            <w:tcW w:type="dxa" w:w="3475"/>
+            <w:tcW w:type="dxa" w:w="3513"/>
           </w:tcPr>
           <w:p>
             <w:pPr>
@@ -831,17 +977,31 @@
             </w:pPr>
             <w:r>
               <w:rPr>
-                <w:color w:val="888888"/>
+                <w:color w:val="9A9A9A"/>
                 <w:sz w:val="18"/>
                 <w:rFonts w:ascii="Nirmala UI" w:hAnsi="Nirmala UI" w:cs="Nirmala UI"/>
               </w:rPr>
-              <w:t>वरिष्ठ नेताओं के साथ - फोटो 2</w:t>
+              <w:t>[ फोटो 2 ]</w:t>
+            </w:r>
+          </w:p>
+          <w:p>
+            <w:pPr>
+              <w:jc w:val="center"/>
+            </w:pPr>
+            <w:r>
+              <w:rPr>
+                <w:b/>
+                <w:color w:val="555555"/>
+                <w:sz w:val="18"/>
+                <w:rFonts w:ascii="Nirmala UI" w:hAnsi="Nirmala UI" w:cs="Nirmala UI"/>
+              </w:rPr>
+              <w:t>माननीय डॉ. नरोत्तम मिश्रा जी के साथ</w:t>
             </w:r>
           </w:p>
         </w:tc>
         <w:tc>
           <w:tcPr>
-            <w:tcW w:type="dxa" w:w="3475"/>
+            <w:tcW w:type="dxa" w:w="3513"/>
           </w:tcPr>
           <w:p>
             <w:pPr>
@@ -849,22 +1009,36 @@
             </w:pPr>
             <w:r>
               <w:rPr>
-                <w:color w:val="888888"/>
+                <w:color w:val="9A9A9A"/>
                 <w:sz w:val="18"/>
                 <w:rFonts w:ascii="Nirmala UI" w:hAnsi="Nirmala UI" w:cs="Nirmala UI"/>
               </w:rPr>
-              <w:t>वरिष्ठ नेताओं के साथ - फोटो 3</w:t>
+              <w:t>[ फोटो 3 ]</w:t>
+            </w:r>
+          </w:p>
+          <w:p>
+            <w:pPr>
+              <w:jc w:val="center"/>
+            </w:pPr>
+            <w:r>
+              <w:rPr>
+                <w:b/>
+                <w:color w:val="555555"/>
+                <w:sz w:val="18"/>
+                <w:rFonts w:ascii="Nirmala UI" w:hAnsi="Nirmala UI" w:cs="Nirmala UI"/>
+              </w:rPr>
+              <w:t>विधायक / मंत्री जी के साथ</w:t>
             </w:r>
           </w:p>
         </w:tc>
       </w:tr>
       <w:tr>
         <w:trPr>
-          <w:trHeight w:val="1701"/>
+          <w:trHeight w:val="1928"/>
         </w:trPr>
         <w:tc>
           <w:tcPr>
-            <w:tcW w:type="dxa" w:w="3475"/>
+            <w:tcW w:type="dxa" w:w="3513"/>
           </w:tcPr>
           <w:p>
             <w:pPr>
@@ -872,17 +1046,31 @@
             </w:pPr>
             <w:r>
               <w:rPr>
-                <w:color w:val="888888"/>
+                <w:color w:val="9A9A9A"/>
                 <w:sz w:val="18"/>
                 <w:rFonts w:ascii="Nirmala UI" w:hAnsi="Nirmala UI" w:cs="Nirmala UI"/>
               </w:rPr>
-              <w:t>कार्यक्रम - फोटो 4</w:t>
+              <w:t>[ फोटो 4 ]</w:t>
+            </w:r>
+          </w:p>
+          <w:p>
+            <w:pPr>
+              <w:jc w:val="center"/>
+            </w:pPr>
+            <w:r>
+              <w:rPr>
+                <w:b/>
+                <w:color w:val="555555"/>
+                <w:sz w:val="18"/>
+                <w:rFonts w:ascii="Nirmala UI" w:hAnsi="Nirmala UI" w:cs="Nirmala UI"/>
+              </w:rPr>
+              <w:t>उपचुनाव प्रचार के दौरान</w:t>
             </w:r>
           </w:p>
         </w:tc>
         <w:tc>
           <w:tcPr>
-            <w:tcW w:type="dxa" w:w="3475"/>
+            <w:tcW w:type="dxa" w:w="3513"/>
           </w:tcPr>
           <w:p>
             <w:pPr>
@@ -890,17 +1078,31 @@
             </w:pPr>
             <w:r>
               <w:rPr>
-                <w:color w:val="888888"/>
+                <w:color w:val="9A9A9A"/>
                 <w:sz w:val="18"/>
                 <w:rFonts w:ascii="Nirmala UI" w:hAnsi="Nirmala UI" w:cs="Nirmala UI"/>
               </w:rPr>
-              <w:t>कार्यक्रम - फोटो 5</w:t>
+              <w:t>[ फोटो 5 ]</w:t>
+            </w:r>
+          </w:p>
+          <w:p>
+            <w:pPr>
+              <w:jc w:val="center"/>
+            </w:pPr>
+            <w:r>
+              <w:rPr>
+                <w:b/>
+                <w:color w:val="555555"/>
+                <w:sz w:val="18"/>
+                <w:rFonts w:ascii="Nirmala UI" w:hAnsi="Nirmala UI" w:cs="Nirmala UI"/>
+              </w:rPr>
+              <w:t>संगठन बैठक / रैली</w:t>
             </w:r>
           </w:p>
         </w:tc>
         <w:tc>
           <w:tcPr>
-            <w:tcW w:type="dxa" w:w="3475"/>
+            <w:tcW w:type="dxa" w:w="3513"/>
           </w:tcPr>
           <w:p>
             <w:pPr>
@@ -908,11 +1110,25 @@
             </w:pPr>
             <w:r>
               <w:rPr>
-                <w:color w:val="888888"/>
+                <w:color w:val="9A9A9A"/>
                 <w:sz w:val="18"/>
                 <w:rFonts w:ascii="Nirmala UI" w:hAnsi="Nirmala UI" w:cs="Nirmala UI"/>
               </w:rPr>
-              <w:t>कार्यक्रम - फोटो 6</w:t>
+              <w:t>[ फोटो 6 ]</w:t>
+            </w:r>
+          </w:p>
+          <w:p>
+            <w:pPr>
+              <w:jc w:val="center"/>
+            </w:pPr>
+            <w:r>
+              <w:rPr>
+                <w:b/>
+                <w:color w:val="555555"/>
+                <w:sz w:val="18"/>
+                <w:rFonts w:ascii="Nirmala UI" w:hAnsi="Nirmala UI" w:cs="Nirmala UI"/>
+              </w:rPr>
+              <w:t>सामाजिक सेवा कार्य</w:t>
             </w:r>
           </w:p>
         </w:tc>
@@ -928,7 +1144,7 @@
         <w:spacing w:before="180" w:after="100"/>
         <w:shd w:val="clear" w:color="auto" w:fill="FF9933"/>
         <w:pBdr>
-          <w:left w:val="single" w:sz="32" w:space="6" w:color="138808"/>
+          <w:left w:val="single" w:sz="36" w:space="6" w:color="138808"/>
         </w:pBdr>
       </w:pPr>
       <w:r>
@@ -938,30 +1154,31 @@
           <w:sz w:val="26"/>
           <w:rFonts w:ascii="Nirmala UI" w:hAnsi="Nirmala UI" w:cs="Nirmala UI"/>
         </w:rPr>
-        <w:t>वायरल पोस्ट / रील (यहाँ स्क्रीनशॉट लगाएँ)</w:t>
+        <w:t>वायरल पोस्ट / रील</w:t>
       </w:r>
     </w:p>
     <w:tbl>
       <w:tblPr>
         <w:tblStyle w:val="TableGrid"/>
         <w:tblW w:type="auto" w:w="0"/>
+        <w:jc w:val="center"/>
         <w:tblLook w:firstColumn="1" w:firstRow="1" w:lastColumn="0" w:lastRow="0" w:noHBand="0" w:noVBand="1" w:val="04A0"/>
       </w:tblPr>
       <w:tblGrid>
-        <w:gridCol w:w="1738"/>
-        <w:gridCol w:w="1738"/>
-        <w:gridCol w:w="1738"/>
-        <w:gridCol w:w="1738"/>
-        <w:gridCol w:w="1738"/>
-        <w:gridCol w:w="1738"/>
+        <w:gridCol w:w="1757"/>
+        <w:gridCol w:w="1757"/>
+        <w:gridCol w:w="1757"/>
+        <w:gridCol w:w="1757"/>
+        <w:gridCol w:w="1757"/>
+        <w:gridCol w:w="1757"/>
       </w:tblGrid>
       <w:tr>
         <w:trPr>
-          <w:trHeight w:val="1928"/>
+          <w:trHeight w:val="2041"/>
         </w:trPr>
         <w:tc>
           <w:tcPr>
-            <w:tcW w:type="dxa" w:w="1738"/>
+            <w:tcW w:type="dxa" w:w="1757"/>
           </w:tcPr>
           <w:p>
             <w:pPr>
@@ -969,7 +1186,8 @@
             </w:pPr>
             <w:r>
               <w:rPr>
-                <w:color w:val="888888"/>
+                <w:b w:val="0"/>
+                <w:color w:val="9A9A9A"/>
                 <w:sz w:val="18"/>
                 <w:rFonts w:ascii="Nirmala UI" w:hAnsi="Nirmala UI" w:cs="Nirmala UI"/>
               </w:rPr>
@@ -979,7 +1197,7 @@
         </w:tc>
         <w:tc>
           <w:tcPr>
-            <w:tcW w:type="dxa" w:w="1738"/>
+            <w:tcW w:type="dxa" w:w="1757"/>
           </w:tcPr>
           <w:p>
             <w:pPr>
@@ -987,7 +1205,8 @@
             </w:pPr>
             <w:r>
               <w:rPr>
-                <w:color w:val="888888"/>
+                <w:b w:val="0"/>
+                <w:color w:val="9A9A9A"/>
                 <w:sz w:val="18"/>
                 <w:rFonts w:ascii="Nirmala UI" w:hAnsi="Nirmala UI" w:cs="Nirmala UI"/>
               </w:rPr>
@@ -997,7 +1216,7 @@
         </w:tc>
         <w:tc>
           <w:tcPr>
-            <w:tcW w:type="dxa" w:w="1738"/>
+            <w:tcW w:type="dxa" w:w="1757"/>
           </w:tcPr>
           <w:p>
             <w:pPr>
@@ -1005,7 +1224,8 @@
             </w:pPr>
             <w:r>
               <w:rPr>
-                <w:color w:val="888888"/>
+                <w:b w:val="0"/>
+                <w:color w:val="9A9A9A"/>
                 <w:sz w:val="18"/>
                 <w:rFonts w:ascii="Nirmala UI" w:hAnsi="Nirmala UI" w:cs="Nirmala UI"/>
               </w:rPr>
@@ -1015,7 +1235,7 @@
         </w:tc>
         <w:tc>
           <w:tcPr>
-            <w:tcW w:type="dxa" w:w="1738"/>
+            <w:tcW w:type="dxa" w:w="1757"/>
           </w:tcPr>
           <w:p>
             <w:pPr>
@@ -1023,7 +1243,8 @@
             </w:pPr>
             <w:r>
               <w:rPr>
-                <w:color w:val="888888"/>
+                <w:b w:val="0"/>
+                <w:color w:val="9A9A9A"/>
                 <w:sz w:val="18"/>
                 <w:rFonts w:ascii="Nirmala UI" w:hAnsi="Nirmala UI" w:cs="Nirmala UI"/>
               </w:rPr>
@@ -1033,7 +1254,7 @@
         </w:tc>
         <w:tc>
           <w:tcPr>
-            <w:tcW w:type="dxa" w:w="1738"/>
+            <w:tcW w:type="dxa" w:w="1757"/>
           </w:tcPr>
           <w:p>
             <w:pPr>
@@ -1041,7 +1262,8 @@
             </w:pPr>
             <w:r>
               <w:rPr>
-                <w:color w:val="888888"/>
+                <w:b w:val="0"/>
+                <w:color w:val="9A9A9A"/>
                 <w:sz w:val="18"/>
                 <w:rFonts w:ascii="Nirmala UI" w:hAnsi="Nirmala UI" w:cs="Nirmala UI"/>
               </w:rPr>
@@ -1051,7 +1273,7 @@
         </w:tc>
         <w:tc>
           <w:tcPr>
-            <w:tcW w:type="dxa" w:w="1738"/>
+            <w:tcW w:type="dxa" w:w="1757"/>
           </w:tcPr>
           <w:p>
             <w:pPr>
@@ -1059,7 +1281,8 @@
             </w:pPr>
             <w:r>
               <w:rPr>
-                <w:color w:val="888888"/>
+                <w:b/>
+                <w:color w:val="0E6606"/>
                 <w:sz w:val="18"/>
                 <w:rFonts w:ascii="Nirmala UI" w:hAnsi="Nirmala UI" w:cs="Nirmala UI"/>
               </w:rPr>
@@ -1070,23 +1293,66 @@
       </w:tr>
     </w:tbl>
     <w:p/>
-    <w:p>
-      <w:r>
-        <w:rPr>
-          <w:b/>
-          <w:rFonts w:ascii="Nirmala UI" w:hAnsi="Nirmala UI" w:cs="Nirmala UI"/>
-        </w:rPr>
-        <w:t>दिनांक: ____________          स्थान: दतिया          हस्ताक्षर: एडवोकेट कप्तान सिंह कुशवाह</w:t>
-      </w:r>
-    </w:p>
+    <w:p/>
+    <w:tbl>
+      <w:tblPr>
+        <w:tblW w:type="auto" w:w="0"/>
+        <w:jc w:val="center"/>
+        <w:tblLook w:firstColumn="1" w:firstRow="1" w:lastColumn="0" w:lastRow="0" w:noHBand="0" w:noVBand="1" w:val="04A0"/>
+      </w:tblPr>
+      <w:tblGrid>
+        <w:gridCol w:w="5270"/>
+        <w:gridCol w:w="5270"/>
+      </w:tblGrid>
+      <w:tr>
+        <w:tc>
+          <w:tcPr>
+            <w:tcW w:type="dxa" w:w="5270"/>
+          </w:tcPr>
+          <w:p>
+            <w:r>
+              <w:rPr>
+                <w:b/>
+                <w:rFonts w:ascii="Nirmala UI" w:hAnsi="Nirmala UI" w:cs="Nirmala UI"/>
+              </w:rPr>
+              <w:t>दिनांक: ____________</w:t>
+              <w:br/>
+              <w:t>स्थान: दतिया</w:t>
+            </w:r>
+          </w:p>
+        </w:tc>
+        <w:tc>
+          <w:tcPr>
+            <w:tcW w:type="dxa" w:w="5270"/>
+          </w:tcPr>
+          <w:p>
+            <w:pPr>
+              <w:jc w:val="right"/>
+            </w:pPr>
+            <w:r>
+              <w:rPr>
+                <w:b/>
+                <w:rFonts w:ascii="Nirmala UI" w:hAnsi="Nirmala UI" w:cs="Nirmala UI"/>
+              </w:rPr>
+              <w:t>________________________</w:t>
+              <w:br/>
+              <w:t>एडवोकेट कप्तान सिंह कुशवाह</w:t>
+              <w:br/>
+              <w:t>मोबाइल: 9584523005</w:t>
+            </w:r>
+          </w:p>
+        </w:tc>
+      </w:tr>
+    </w:tbl>
     <w:p>
       <w:pPr>
+        <w:spacing w:before="280"/>
         <w:jc w:val="center"/>
       </w:pPr>
       <w:r>
         <w:rPr>
           <w:b/>
-          <w:color w:val="FF9933"/>
+          <w:color w:val="E97E12"/>
           <w:sz w:val="30"/>
           <w:rFonts w:ascii="Nirmala UI" w:hAnsi="Nirmala UI" w:cs="Nirmala UI"/>
         </w:rPr>
@@ -1095,7 +1361,7 @@
     </w:p>
     <w:sectPr>
       <w:pgSz w:w="12240" w:h="15840"/>
-      <w:pgMar w:top="794" w:right="907" w:bottom="794" w:left="907" w:header="720" w:footer="720" w:gutter="0"/>
+      <w:pgMar w:top="680" w:right="850" w:bottom="680" w:left="850" w:header="720" w:footer="720" w:gutter="0"/>
       <w:cols w:space="720"/>
       <w:docGrid w:linePitch="360"/>
     </w:sectPr>
@@ -1468,7 +1734,7 @@
     <w:rsid w:val="00FC693F"/>
     <w:rPr>
       <w:rFonts w:ascii="Nirmala UI" w:hAnsi="Nirmala UI" w:cs="Nirmala UI"/>
-      <w:sz w:val="22"/>
+      <w:sz w:val="21"/>
     </w:rPr>
   </w:style>
   <w:style w:type="paragraph" w:styleId="Header">

</xml_diff>